<commit_message>
log: website live with the 1.5M BP final; report note updated
</commit_message>
<xml_diff>
--- a/report/report.docx
+++ b/report/report.docx
@@ -28341,7 +28341,7 @@
         <w:t>experiments/job_visuals_final_cpu.sbatch</w:t>
       </w:r>
       <w:r>
-        <w:t xml:space="preserve">) is public at https://triborough.cs.nyu.edu/hsr3649/demdemo/webapp/compare.html. Its code now shows the final BP model as run </w:t>
+        <w:t xml:space="preserve">) is public at https://triborough.cs.nyu.edu/hsr3649/demdemo/webapp/compare.html. It shows the final BP model as run </w:t>
       </w:r>
       <w:r>
         <w:rPr>
@@ -28350,16 +28350,7 @@
         <w:t>bp_mlp6_h680_clamp</w:t>
       </w:r>
       <w:r>
-        <w:t>, with the self-check of section 7.1 blanking pixels whose DEM overshoots the observation by more than 100 times; the ElasticNet run is unchanged (</w:t>
-      </w:r>
-      <w:r>
-        <w:rPr>
-          <w:rFonts w:ascii="Consolas" w:hAnsi="Consolas"/>
-        </w:rPr>
-        <w:t>enet_mlp6_h336_sqrtff</w:t>
-      </w:r>
-      <w:r>
-        <w:t>). From 2026-10-19 the site showed the 409k stiff-band model (312 BP images), and an audit that day found all 1,875 build files byte-identical on the live site and all 72 numbers in its Results view matching the result JSONs; that audit has not been repeated for the new run. The server's TLS certificate expired on 2026-09-16, so browsers show a security warning; the warning concerns the server, not the viewer. The server was unreachable from 21 to 23 October and back on 24 October; a full copy of the site (6.5 GB) is kept off the server.</w:t>
+        <w:t>, with the self-check of section 7.1 blanking pixels whose DEM overshoots the observation by more than 100 times, and the unchanged ElasticNet model, against the solver and the supervised model on eight test dates. Uploaded 30 October 2026; all 315 uploaded files were checked byte for byte against the staged copy. The server's TLS certificate expired on 16 September 2026, so browsers show a security warning.</w:t>
       </w:r>
     </w:p>
     <w:p>

</xml_diff>

<commit_message>
paper: two-column draft with penalty calibration, verified bibliography and figures; correct the blow-up account
The 1.5M model's DEM MSE of 897 was one unclamped flare pixel, not the clamp; report and log corrected.
Adds the per-pixel mu_0 check, the drop-threshold check and an inference timing script.
</commit_message>
<xml_diff>
--- a/report/report.docx
+++ b/report/report.docx
@@ -12,7 +12,7 @@
     </w:p>
     <w:p>
       <w:r>
-        <w:t>Built 2026-10-30 from 13 section files.</w:t>
+        <w:t>Built 2026-10-31 from 13 section files.</w:t>
       </w:r>
     </w:p>
     <w:p>
@@ -1933,7 +1933,7 @@
         <w:t>The law holds.</w:t>
       </w:r>
       <w:r>
-        <w:t xml:space="preserve"> At μ = 100 the measured violation divided by the predicted one has a median of 1.00 over 45,925 violated pixel-channels, and the median is 1.00 in every brightness band for μ ≥ 10. μ times the violation stays constant from μ = 10 to 1,000 (a coefficient of variation of 0.00 to 0.06 at the median pixel below flare cores, 0.19 at flare cores). Below μ ≈ 10 the best answer drops basis elements the linear program keeps, the hot plasma at bright pixels, and the first-order law no longer applies (at flare cores the median ratio is 0.66 at μ = 1).</w:t>
+        <w:t xml:space="preserve"> At μ = 100 the measured violation divided by the predicted one has a median of 1.00 over 45,925 violated pixel-channels, and the median is 1.00 in every band below flare cores for μ ≥ 10 and at flare cores for μ ≥ 30. μ times the violation stays constant from μ = 10 to 1,000 (a coefficient of variation of 0.00 to 0.06 at the median pixel below flare cores, 0.19 at flare cores). Below μ ≈ 10 the best answer drops basis elements the linear program keeps, the hot plasma at bright pixels, and the first-order law no longer applies (at flare cores the median ratio is 0.66 at μ = 1).</w:t>
       </w:r>
     </w:p>
     <w:p>
@@ -20737,6 +20737,44 @@
     <w:p>
       <w:r>
         <w:t>The score blow-ups are gone: two models that failed by orders of magnitude now score normally, and the 1.5M BP model is the best BP model we have, which is why it became the final model. Clamp pixels do not help the 409k models. They take a large share of each epoch's draws, and a small network pays for that: BP loses flare-core emission, and ElasticNet loses on faint pixels too (Quiet MSE 0.122 to 0.212, median pixel error 0.85 to 1.55). The ElasticNet 10M model still trails the 409k model and keeps a few wild reconstructions, so its failure is reduced rather than removed.</w:t>
+      </w:r>
+    </w:p>
+    <w:p>
+      <w:r>
+        <w:rPr>
+          <w:b/>
+        </w:rPr>
+        <w:t>Correction (31 October 2026).</w:t>
+      </w:r>
+      <w:r>
+        <w:t xml:space="preserve"> The drop from 897 to 1.08 in Table 7.2 is not evidence for the clamp account on its own. In the 1.5M run with clamp pixels excluded, one unclamped flare-core input (131 Å above 90,000 DN/s), seen through two targets, holds 96.7% of the squared error, and pixels with a clamped channel hold 2.9% (</w:t>
+      </w:r>
+      <w:r>
+        <w:rPr>
+          <w:rFonts w:ascii="Consolas" w:hAnsi="Consolas"/>
+        </w:rPr>
+        <w:t>bp_blowup_census.npz</w:t>
+      </w:r>
+      <w:r>
+        <w:t xml:space="preserve">, arrays </w:t>
+      </w:r>
+      <w:r>
+        <w:rPr>
+          <w:rFonts w:ascii="Consolas" w:hAnsi="Consolas"/>
+        </w:rPr>
+        <w:t>worst_h680_mu100_ep120_*</w:t>
+      </w:r>
+      <w:r>
+        <w:t xml:space="preserve">; flare cores hold 97.1%, </w:t>
+      </w:r>
+      <w:r>
+        <w:rPr>
+          <w:rFonts w:ascii="Consolas" w:hAnsi="Consolas"/>
+        </w:rPr>
+        <w:t>results/plots/21_followup_20261006/bp_bright_failure_fu_bp_mu100_h680_ep120.txt</w:t>
+      </w:r>
+      <w:r>
+        <w:t>). The clamp account does hold for the BP 10M model and the ElasticNet 722k, 1.43M and 10M models (93% to 99% of the squared error in clamped pixels), and on the 1.5M model it shows in Quiet MSE (12.5 to 0.033). Why the final model does not fail on that flare-core input is unknown; with one run of each configuration it may be chance.</w:t>
       </w:r>
     </w:p>
     <w:p>

</xml_diff>